<commit_message>
Update 3GPP specifications 2026-04-02
</commit_message>
<xml_diff>
--- a/TS 33.250 - PGW/v.19.0.0/33250-v1900.docx
+++ b/TS 33.250 - PGW/v.19.0.0/33250-v1900.docx
@@ -516,7 +516,7 @@
                                 <v:shape id="ole_rId2" type="_x0000_tole_rId2" style="width:95.1pt;height:58.7pt" filled="f" o:ole="">
                                   <v:imagedata r:id="rId3" o:title=""/>
                                 </v:shape>
-                                <o:OLEObject Type="Embed" ProgID="" ShapeID="ole_rId2" DrawAspect="Content" ObjectID="_542100446" r:id="rId2"/>
+                                <o:OLEObject Type="Embed" ProgID="" ShapeID="ole_rId2" DrawAspect="Content" ObjectID="_2054805144" r:id="rId2"/>
                               </w:object>
                             </w:r>
                             <w:r>
@@ -649,7 +649,7 @@
                           <v:shape id="ole_rId5" type="_x0000_tole_rId5" style="width:95.1pt;height:58.7pt" filled="f" o:ole="">
                             <v:imagedata r:id="rId6" o:title=""/>
                           </v:shape>
-                          <o:OLEObject Type="Embed" ProgID="" ShapeID="ole_rId5" DrawAspect="Content" ObjectID="_987744326" r:id="rId5"/>
+                          <o:OLEObject Type="Embed" ProgID="" ShapeID="ole_rId5" DrawAspect="Content" ObjectID="_1652095087" r:id="rId5"/>
                         </w:object>
                       </w:r>
                       <w:r>

</xml_diff>

<commit_message>
Update 3GPP specifications 2026-05-14
</commit_message>
<xml_diff>
--- a/TS 33.250 - PGW/v.19.0.0/33250-v1900.docx
+++ b/TS 33.250 - PGW/v.19.0.0/33250-v1900.docx
@@ -516,7 +516,7 @@
                                 <v:shape id="ole_rId2" type="_x0000_tole_rId2" style="width:95.1pt;height:58.7pt" filled="f" o:ole="">
                                   <v:imagedata r:id="rId3" o:title=""/>
                                 </v:shape>
-                                <o:OLEObject Type="Embed" ProgID="" ShapeID="ole_rId2" DrawAspect="Content" ObjectID="_1691841005" r:id="rId2"/>
+                                <o:OLEObject Type="Embed" ProgID="" ShapeID="ole_rId2" DrawAspect="Content" ObjectID="_833873084" r:id="rId2"/>
                               </w:object>
                             </w:r>
                             <w:r>
@@ -649,7 +649,7 @@
                           <v:shape id="ole_rId5" type="_x0000_tole_rId5" style="width:95.1pt;height:58.7pt" filled="f" o:ole="">
                             <v:imagedata r:id="rId6" o:title=""/>
                           </v:shape>
-                          <o:OLEObject Type="Embed" ProgID="" ShapeID="ole_rId5" DrawAspect="Content" ObjectID="_593769542" r:id="rId5"/>
+                          <o:OLEObject Type="Embed" ProgID="" ShapeID="ole_rId5" DrawAspect="Content" ObjectID="_57763494" r:id="rId5"/>
                         </w:object>
                       </w:r>
                       <w:r>

</xml_diff>

<commit_message>
Update 3GPP specifications 2026-05-25
</commit_message>
<xml_diff>
--- a/TS 33.250 - PGW/v.19.0.0/33250-v1900.docx
+++ b/TS 33.250 - PGW/v.19.0.0/33250-v1900.docx
@@ -516,7 +516,7 @@
                                 <v:shape id="ole_rId2" type="_x0000_tole_rId2" style="width:95.1pt;height:58.7pt" filled="f" o:ole="">
                                   <v:imagedata r:id="rId3" o:title=""/>
                                 </v:shape>
-                                <o:OLEObject Type="Embed" ProgID="" ShapeID="ole_rId2" DrawAspect="Content" ObjectID="_833873084" r:id="rId2"/>
+                                <o:OLEObject Type="Embed" ProgID="" ShapeID="ole_rId2" DrawAspect="Content" ObjectID="_1394175097" r:id="rId2"/>
                               </w:object>
                             </w:r>
                             <w:r>
@@ -649,7 +649,7 @@
                           <v:shape id="ole_rId5" type="_x0000_tole_rId5" style="width:95.1pt;height:58.7pt" filled="f" o:ole="">
                             <v:imagedata r:id="rId6" o:title=""/>
                           </v:shape>
-                          <o:OLEObject Type="Embed" ProgID="" ShapeID="ole_rId5" DrawAspect="Content" ObjectID="_57763494" r:id="rId5"/>
+                          <o:OLEObject Type="Embed" ProgID="" ShapeID="ole_rId5" DrawAspect="Content" ObjectID="_1554758339" r:id="rId5"/>
                         </w:object>
                       </w:r>
                       <w:r>

</xml_diff>

<commit_message>
Update 3GPP specifications 2026-06-08
</commit_message>
<xml_diff>
--- a/TS 33.250 - PGW/v.19.0.0/33250-v1900.docx
+++ b/TS 33.250 - PGW/v.19.0.0/33250-v1900.docx
@@ -516,7 +516,7 @@
                                 <v:shape id="ole_rId2" type="_x0000_tole_rId2" style="width:95.1pt;height:58.7pt" filled="f" o:ole="">
                                   <v:imagedata r:id="rId3" o:title=""/>
                                 </v:shape>
-                                <o:OLEObject Type="Embed" ProgID="" ShapeID="ole_rId2" DrawAspect="Content" ObjectID="_1394175097" r:id="rId2"/>
+                                <o:OLEObject Type="Embed" ProgID="" ShapeID="ole_rId2" DrawAspect="Content" ObjectID="_1787107831" r:id="rId2"/>
                               </w:object>
                             </w:r>
                             <w:r>
@@ -649,7 +649,7 @@
                           <v:shape id="ole_rId5" type="_x0000_tole_rId5" style="width:95.1pt;height:58.7pt" filled="f" o:ole="">
                             <v:imagedata r:id="rId6" o:title=""/>
                           </v:shape>
-                          <o:OLEObject Type="Embed" ProgID="" ShapeID="ole_rId5" DrawAspect="Content" ObjectID="_1554758339" r:id="rId5"/>
+                          <o:OLEObject Type="Embed" ProgID="" ShapeID="ole_rId5" DrawAspect="Content" ObjectID="_1703722730" r:id="rId5"/>
                         </w:object>
                       </w:r>
                       <w:r>

</xml_diff>

<commit_message>
Update 3GPP specifications 2026-06-22
</commit_message>
<xml_diff>
--- a/TS 33.250 - PGW/v.19.0.0/33250-v1900.docx
+++ b/TS 33.250 - PGW/v.19.0.0/33250-v1900.docx
@@ -516,7 +516,7 @@
                                 <v:shape id="ole_rId2" type="_x0000_tole_rId2" style="width:95.1pt;height:58.7pt" filled="f" o:ole="">
                                   <v:imagedata r:id="rId3" o:title=""/>
                                 </v:shape>
-                                <o:OLEObject Type="Embed" ProgID="" ShapeID="ole_rId2" DrawAspect="Content" ObjectID="_1787107831" r:id="rId2"/>
+                                <o:OLEObject Type="Embed" ProgID="" ShapeID="ole_rId2" DrawAspect="Content" ObjectID="_1121296637" r:id="rId2"/>
                               </w:object>
                             </w:r>
                             <w:r>
@@ -649,7 +649,7 @@
                           <v:shape id="ole_rId5" type="_x0000_tole_rId5" style="width:95.1pt;height:58.7pt" filled="f" o:ole="">
                             <v:imagedata r:id="rId6" o:title=""/>
                           </v:shape>
-                          <o:OLEObject Type="Embed" ProgID="" ShapeID="ole_rId5" DrawAspect="Content" ObjectID="_1703722730" r:id="rId5"/>
+                          <o:OLEObject Type="Embed" ProgID="" ShapeID="ole_rId5" DrawAspect="Content" ObjectID="_1588100599" r:id="rId5"/>
                         </w:object>
                       </w:r>
                       <w:r>

</xml_diff>

<commit_message>
Update 3GPP specifications 2026-07-06
</commit_message>
<xml_diff>
--- a/TS 33.250 - PGW/v.19.0.0/33250-v1900.docx
+++ b/TS 33.250 - PGW/v.19.0.0/33250-v1900.docx
@@ -516,7 +516,7 @@
                                 <v:shape id="ole_rId2" type="_x0000_tole_rId2" style="width:95.1pt;height:58.7pt" filled="f" o:ole="">
                                   <v:imagedata r:id="rId3" o:title=""/>
                                 </v:shape>
-                                <o:OLEObject Type="Embed" ProgID="" ShapeID="ole_rId2" DrawAspect="Content" ObjectID="_1121296637" r:id="rId2"/>
+                                <o:OLEObject Type="Embed" ProgID="" ShapeID="ole_rId2" DrawAspect="Content" ObjectID="_222855316" r:id="rId2"/>
                               </w:object>
                             </w:r>
                             <w:r>
@@ -649,7 +649,7 @@
                           <v:shape id="ole_rId5" type="_x0000_tole_rId5" style="width:95.1pt;height:58.7pt" filled="f" o:ole="">
                             <v:imagedata r:id="rId6" o:title=""/>
                           </v:shape>
-                          <o:OLEObject Type="Embed" ProgID="" ShapeID="ole_rId5" DrawAspect="Content" ObjectID="_1588100599" r:id="rId5"/>
+                          <o:OLEObject Type="Embed" ProgID="" ShapeID="ole_rId5" DrawAspect="Content" ObjectID="_680695308" r:id="rId5"/>
                         </w:object>
                       </w:r>
                       <w:r>

</xml_diff>

<commit_message>
Update 3GPP specifications 2026-07-20
</commit_message>
<xml_diff>
--- a/TS 33.250 - PGW/v.19.0.0/33250-v1900.docx
+++ b/TS 33.250 - PGW/v.19.0.0/33250-v1900.docx
@@ -516,7 +516,7 @@
                                 <v:shape id="ole_rId2" type="_x0000_tole_rId2" style="width:95.1pt;height:58.7pt" filled="f" o:ole="">
                                   <v:imagedata r:id="rId3" o:title=""/>
                                 </v:shape>
-                                <o:OLEObject Type="Embed" ProgID="" ShapeID="ole_rId2" DrawAspect="Content" ObjectID="_222855316" r:id="rId2"/>
+                                <o:OLEObject Type="Embed" ProgID="" ShapeID="ole_rId2" DrawAspect="Content" ObjectID="_1979627435" r:id="rId2"/>
                               </w:object>
                             </w:r>
                             <w:r>
@@ -649,7 +649,7 @@
                           <v:shape id="ole_rId5" type="_x0000_tole_rId5" style="width:95.1pt;height:58.7pt" filled="f" o:ole="">
                             <v:imagedata r:id="rId6" o:title=""/>
                           </v:shape>
-                          <o:OLEObject Type="Embed" ProgID="" ShapeID="ole_rId5" DrawAspect="Content" ObjectID="_680695308" r:id="rId5"/>
+                          <o:OLEObject Type="Embed" ProgID="" ShapeID="ole_rId5" DrawAspect="Content" ObjectID="_877200927" r:id="rId5"/>
                         </w:object>
                       </w:r>
                       <w:r>

</xml_diff>